<commit_message>
add stepik stage 3 report
</commit_message>
<xml_diff>
--- a/stepik/stage 3/report/arch-pc-stage3-report.docx
+++ b/stepik/stage 3/report/arch-pc-stage3-report.docx
@@ -19,7 +19,7 @@
         <w:t xml:space="preserve"> </w:t>
       </w:r>
       <w:r>
-        <w:t xml:space="preserve">второму</w:t>
+        <w:t xml:space="preserve">третьему</w:t>
       </w:r>
       <w:r>
         <w:t xml:space="preserve"> </w:t>
@@ -51,19 +51,13 @@
         <w:pStyle w:val="Subtitle"/>
       </w:pPr>
       <w:r>
-        <w:t xml:space="preserve">Работа</w:t>
-      </w:r>
-      <w:r>
-        <w:t xml:space="preserve"> </w:t>
-      </w:r>
-      <w:r>
-        <w:t xml:space="preserve">на</w:t>
-      </w:r>
-      <w:r>
-        <w:t xml:space="preserve"> </w:t>
-      </w:r>
-      <w:r>
-        <w:t xml:space="preserve">сервере</w:t>
+        <w:t xml:space="preserve">Продвинутые</w:t>
+      </w:r>
+      <w:r>
+        <w:t xml:space="preserve"> </w:t>
+      </w:r>
+      <w:r>
+        <w:t xml:space="preserve">темы</w:t>
       </w:r>
     </w:p>
     <w:p>
@@ -160,7 +154,6 @@
           <w:ilvl w:val="0"/>
           <w:numId w:val="1001"/>
         </w:numPr>
-        <w:pStyle w:val="Compact"/>
       </w:pPr>
       <w:r>
         <w:t xml:space="preserve">Ознакомиться с теоретическим материалом</w:t>
@@ -172,7 +165,6 @@
           <w:ilvl w:val="0"/>
           <w:numId w:val="1001"/>
         </w:numPr>
-        <w:pStyle w:val="Compact"/>
       </w:pPr>
       <w:r>
         <w:t xml:space="preserve">Ответить на вопросы и выполнить задания для закрепления теоретического материала</w:t>
@@ -188,13 +180,13 @@
         <w:t xml:space="preserve">3. Выполнение лабораторной работы</w:t>
       </w:r>
     </w:p>
-    <w:bookmarkStart w:id="42" w:name="выполнение-2.1.-текстовый-редактор-vim"/>
+    <w:bookmarkStart w:id="42" w:name="выполнение-3.1.-текстовый-редактор-vim"/>
     <w:p>
       <w:pPr>
         <w:pStyle w:val="Heading2"/>
       </w:pPr>
       <w:r>
-        <w:t xml:space="preserve">3.1 Выполнение 2.1. Текстовый редактор vim</w:t>
+        <w:t xml:space="preserve">3.1 Выполнение 3.1. Текстовый редактор vim</w:t>
       </w:r>
     </w:p>
     <w:p>
@@ -3146,14 +3138,6 @@
         <w:pStyle w:val="FirstParagraph"/>
       </w:pPr>
       <w:r>
-        <w:t xml:space="preserve">В этом разделе рассматривались арифметика, функции и специальные приёмы.</w:t>
-      </w:r>
-    </w:p>
-    <w:p>
-      <w:pPr>
-        <w:pStyle w:val="BodyText"/>
-      </w:pPr>
-      <w:r>
         <w:t xml:space="preserve">Увеличить переменную</w:t>
       </w:r>
       <w:r>
@@ -4855,62 +4839,6 @@
         <w:pStyle w:val="FirstParagraph"/>
       </w:pPr>
       <w:r>
-        <w:t xml:space="preserve">Рассматривались расширенные возможности</w:t>
-      </w:r>
-      <w:r>
-        <w:t xml:space="preserve"> </w:t>
-      </w:r>
-      <w:r>
-        <w:t xml:space="preserve">“</w:t>
-      </w:r>
-      <w:r>
-        <w:t xml:space="preserve">find</w:t>
-      </w:r>
-      <w:r>
-        <w:t xml:space="preserve">”</w:t>
-      </w:r>
-      <w:r>
-        <w:t xml:space="preserve">,</w:t>
-      </w:r>
-      <w:r>
-        <w:t xml:space="preserve"> </w:t>
-      </w:r>
-      <w:r>
-        <w:t xml:space="preserve">“</w:t>
-      </w:r>
-      <w:r>
-        <w:t xml:space="preserve">grep</w:t>
-      </w:r>
-      <w:r>
-        <w:t xml:space="preserve">”</w:t>
-      </w:r>
-      <w:r>
-        <w:t xml:space="preserve"> </w:t>
-      </w:r>
-      <w:r>
-        <w:t xml:space="preserve">и</w:t>
-      </w:r>
-      <w:r>
-        <w:t xml:space="preserve"> </w:t>
-      </w:r>
-      <w:r>
-        <w:t xml:space="preserve">“</w:t>
-      </w:r>
-      <w:r>
-        <w:t xml:space="preserve">sed</w:t>
-      </w:r>
-      <w:r>
-        <w:t xml:space="preserve">”</w:t>
-      </w:r>
-      <w:r>
-        <w:t xml:space="preserve">.</w:t>
-      </w:r>
-    </w:p>
-    <w:p>
-      <w:pPr>
-        <w:pStyle w:val="BodyText"/>
-      </w:pPr>
-      <w:r>
         <w:t xml:space="preserve">Команда</w:t>
       </w:r>
       <w:r>
@@ -6992,14 +6920,6 @@
         <w:pStyle w:val="FirstParagraph"/>
       </w:pPr>
       <w:r>
-        <w:t xml:space="preserve">Последний блок объединил несколько независимых тем.</w:t>
-      </w:r>
-    </w:p>
-    <w:p>
-      <w:pPr>
-        <w:pStyle w:val="BodyText"/>
-      </w:pPr>
-      <w:r>
         <w:t xml:space="preserve">Для превращения прав</w:t>
       </w:r>
       <w:r>
@@ -7863,7 +7783,7 @@
         <w:pStyle w:val="FirstParagraph"/>
       </w:pPr>
       <w:r>
-        <w:t xml:space="preserve">В ходе выполнения третьего этапа курса «Введение в Linux» были освоены продвинутые приёмы работы в vim, написание сценариев на bash с условными переходами и циклами, использование функций, регулярные выражения в grep и sed, построение и анимация графиков в gnuplot, а также ряд полезных утилит (wc, du, chmod). Все поставленные задачи решены успешно, что подтверждается полученными баллами на платформе Stepik.</w:t>
+        <w:t xml:space="preserve">В ходе выполнения третьего этапа курса «Введение в Linux» были освоены продвинутые приёмы работы в vim, написание сценариев на bash с условными переходами и циклами, использование функций, регулярные выражения в grep и sed, построение и анимация графиков в gnuplot, а также ряд полезных утилит (wc, du, chmod)</w:t>
       </w:r>
     </w:p>
     <w:bookmarkEnd w:id="190"/>

</xml_diff>